<commit_message>
Clarify event-specific privacy notice
</commit_message>
<xml_diff>
--- a/assets/hs-govtech-neha-navigator-terms-privacy.docx
+++ b/assets/hs-govtech-neha-navigator-terms-privacy.docx
@@ -96,14 +96,7 @@
               <w:spacing w:after="0"/>
             </w:pPr>
             <w:r>
-              <w:rPr>
-                <w:b/>
-                <w:color w:val="040048"/>
-              </w:rPr>
-              <w:t xml:space="preserve">Plain-language login notice: </w:t>
-            </w:r>
-            <w:r>
-              <w:t>By entering the guide, users should understand that HS GovTech may use submitted contact information to follow up about NEHA, HS CloudSuite, demo requests, app activity, and related resources. HS GovTech does not sell, rent, trade, or distribute contact information to third parties.</w:t>
+              <w:t>Plain-language login notice: Your Privacy Matters: This is a short-term, event-specific conference guide provided by HS GovTech for NEHA attendees. HS GovTech may use your contact information to support your use of the guide and follow up about NEHA and related resources. HS GovTech does not sell, rent, trade, or distribute your contact information to third parties. By entering the guide, you agree to the Terms &amp; Privacy Notice.</w:t>
             </w:r>
           </w:p>
         </w:tc>
@@ -119,12 +112,19 @@
     </w:p>
     <w:p>
       <w:r>
-        <w:t>These Terms of Use &amp; Privacy Notice describe how the HS GovTech NEHA Navigator app may be used and how information submitted through the app may be collected, used, and protected.</w:t>
+        <w:t>These Terms of Use &amp; Privacy Notice describe how the HS GovTech NEHA Navigator app may be used and how information submitted through the app may be collected, used, protected, and retained.</w:t>
+      </w:r>
+    </w:p>
+    <w:p/>
+    <w:p>
+      <w:r>
+        <w:t>This guide is intended as a short-term, event-specific conference application for NEHA attendees. HS GovTech collects limited contact information and app activity information to operate the guide, support attendee-requested features, manage conference engagement, and follow up regarding NEHA, HS CloudSuite, demo requests, and related resources.</w:t>
       </w:r>
     </w:p>
     <w:p>
+      <w:pPr/>
       <w:r>
-        <w:t>The app is provided by HS GovTech as a conference guide and attendee engagement tool for NEHA. It is intended to help attendees browse sessions, build a personal schedule, access conference-related features, receive app emails, play trivia, participate in community discussions, find nearby Kansas City resources, and connect with HS GovTech.</w:t>
+        <w:t>HS GovTech may retain submitted contact information, demo requests, trivia scores, schedule email requests, community content, and related app records for reasonable conference follow-up and business record purposes, unless deletion is requested where applicable.</w:t>
       </w:r>
     </w:p>
     <w:p>
@@ -190,7 +190,7 @@
     </w:p>
     <w:p>
       <w:r>
-        <w:t>HS GovTech may use contact information submitted through the guide to:</w:t>
+        <w:t>HS GovTech may use contact information and related app activity information submitted through the guide to:</w:t>
       </w:r>
     </w:p>
     <w:p>
@@ -417,7 +417,7 @@
               <w:spacing w:after="0"/>
             </w:pPr>
             <w:r>
-              <w:t>Your Privacy Matters: HS GovTech does not sell, rent, trade, or distribute your contact information to any third parties. By entering the guide, you agree to the Terms &amp; Privacy Notice and acknowledge that HS GovTech may use your contact information to follow up about NEHA, HS CloudSuite, demo requests, and related resources.</w:t>
+              <w:t>Your Privacy Matters: This is a short-term, event-specific conference guide provided by HS GovTech for NEHA attendees. HS GovTech may use your contact information to support your use of the guide and follow up about NEHA and related resources. HS GovTech does not sell, rent, trade, or distribute your contact information to third parties. By entering the guide, you agree to the Terms &amp; Privacy Notice.</w:t>
             </w:r>
           </w:p>
         </w:tc>

</xml_diff>